<commit_message>
User guide shows the pages it describes; UAT script matches the reset
The guide named screens a first-time user had never seen. It now opens
with a page map (what each page is for, how to reach it, which section
covers it) and carries a screenshot of each page it talks about, taken
from the development copy with fictional demonstration data. It also
says that "the Admin" on screen means the Kulliyyah office.

The test script's data section describes production after prepare_uat:
no bookings, and three UAT venues already present, with the steps that
depended on the old single "UAT Room" rewritten for them.

Both Word files are regenerated, the guide with its screenshots.
</commit_message>
<xml_diff>
--- a/docs/AIKOL Booking System - UAT Test Script.docx
+++ b/docs/AIKOL Booking System - UAT Test Script.docx
@@ -359,24 +359,181 @@
         <w:t>Test data.</w:t>
       </w:r>
       <w:r>
-        <w:t xml:space="preserve"> T3 creates these in section 11 before T1 starts booking, or use the demo records if they are still present:</w:t>
+        <w:t xml:space="preserve"> Production has been reset for testing: there are no bookings, and three venues are ready, drawn with placeholder pictures:</w:t>
       </w:r>
     </w:p>
+    <w:tbl>
+      <w:tblPr>
+        <w:tblStyle w:val="TableGrid"/>
+        <w:tblW w:type="auto" w:w="0"/>
+        <w:jc w:val="left"/>
+        <w:tblLook w:firstColumn="1" w:firstRow="1" w:lastColumn="0" w:lastRow="0" w:noHBand="0" w:noVBand="1" w:val="04A0"/>
+      </w:tblPr>
+      <w:tblGrid>
+        <w:gridCol w:w="4873"/>
+        <w:gridCol w:w="4873"/>
+      </w:tblGrid>
+      <w:tr>
+        <w:tc>
+          <w:tcPr>
+            <w:tcW w:type="dxa" w:w="4873"/>
+            <w:shd w:val="clear" w:fill="0A4541"/>
+          </w:tcPr>
+          <w:p>
+            <w:pPr>
+              <w:spacing w:before="40" w:after="40"/>
+            </w:pPr>
+            <w:r/>
+            <w:r>
+              <w:rPr>
+                <w:b/>
+                <w:color w:val="FFFFFF"/>
+                <w:sz w:val="19"/>
+              </w:rPr>
+              <w:t>Venue</w:t>
+            </w:r>
+          </w:p>
+        </w:tc>
+        <w:tc>
+          <w:tcPr>
+            <w:tcW w:type="dxa" w:w="4873"/>
+            <w:shd w:val="clear" w:fill="0A4541"/>
+          </w:tcPr>
+          <w:p>
+            <w:pPr>
+              <w:spacing w:before="40" w:after="40"/>
+            </w:pPr>
+            <w:r/>
+            <w:r>
+              <w:rPr>
+                <w:b/>
+                <w:color w:val="FFFFFF"/>
+                <w:sz w:val="19"/>
+              </w:rPr>
+              <w:t>Seats</w:t>
+            </w:r>
+          </w:p>
+        </w:tc>
+      </w:tr>
+      <w:tr>
+        <w:tc>
+          <w:tcPr>
+            <w:tcW w:type="dxa" w:w="4873"/>
+          </w:tcPr>
+          <w:p>
+            <w:pPr>
+              <w:spacing w:before="40" w:after="40"/>
+            </w:pPr>
+            <w:r/>
+            <w:r>
+              <w:rPr>
+                <w:b/>
+                <w:sz w:val="19"/>
+              </w:rPr>
+              <w:t>UAT Moot Court</w:t>
+            </w:r>
+          </w:p>
+        </w:tc>
+        <w:tc>
+          <w:tcPr>
+            <w:tcW w:type="dxa" w:w="4873"/>
+          </w:tcPr>
+          <w:p>
+            <w:pPr>
+              <w:spacing w:before="40" w:after="40"/>
+            </w:pPr>
+            <w:r/>
+            <w:r>
+              <w:rPr>
+                <w:sz w:val="19"/>
+              </w:rPr>
+              <w:t>80</w:t>
+            </w:r>
+          </w:p>
+        </w:tc>
+      </w:tr>
+      <w:tr>
+        <w:tc>
+          <w:tcPr>
+            <w:tcW w:type="dxa" w:w="4873"/>
+          </w:tcPr>
+          <w:p>
+            <w:pPr>
+              <w:spacing w:before="40" w:after="40"/>
+            </w:pPr>
+            <w:r/>
+            <w:r>
+              <w:rPr>
+                <w:b/>
+                <w:sz w:val="19"/>
+              </w:rPr>
+              <w:t>UAT Seminar Room</w:t>
+            </w:r>
+          </w:p>
+        </w:tc>
+        <w:tc>
+          <w:tcPr>
+            <w:tcW w:type="dxa" w:w="4873"/>
+          </w:tcPr>
+          <w:p>
+            <w:pPr>
+              <w:spacing w:before="40" w:after="40"/>
+            </w:pPr>
+            <w:r/>
+            <w:r>
+              <w:rPr>
+                <w:sz w:val="19"/>
+              </w:rPr>
+              <w:t>40</w:t>
+            </w:r>
+          </w:p>
+        </w:tc>
+      </w:tr>
+      <w:tr>
+        <w:tc>
+          <w:tcPr>
+            <w:tcW w:type="dxa" w:w="4873"/>
+          </w:tcPr>
+          <w:p>
+            <w:pPr>
+              <w:spacing w:before="40" w:after="40"/>
+            </w:pPr>
+            <w:r/>
+            <w:r>
+              <w:rPr>
+                <w:b/>
+                <w:sz w:val="19"/>
+              </w:rPr>
+              <w:t>UAT Meeting Room</w:t>
+            </w:r>
+          </w:p>
+        </w:tc>
+        <w:tc>
+          <w:tcPr>
+            <w:tcW w:type="dxa" w:w="4873"/>
+          </w:tcPr>
+          <w:p>
+            <w:pPr>
+              <w:spacing w:before="40" w:after="40"/>
+            </w:pPr>
+            <w:r/>
+            <w:r>
+              <w:rPr>
+                <w:sz w:val="19"/>
+              </w:rPr>
+              <w:t>10</w:t>
+            </w:r>
+          </w:p>
+        </w:tc>
+      </w:tr>
+    </w:tbl>
+    <w:p/>
     <w:p>
       <w:pPr>
-        <w:pStyle w:val="ListBullet"/>
+        <w:jc w:val="left"/>
       </w:pPr>
       <w:r>
-        <w:t xml:space="preserve">A venue called </w:t>
-      </w:r>
-      <w:r>
-        <w:rPr>
-          <w:b/>
-        </w:rPr>
-        <w:t>UAT Room</w:t>
-      </w:r>
-      <w:r>
-        <w:t xml:space="preserve"> with capacity 10 and one photograph.</w:t>
+        <w:t>T3 adds the rest in section 11 before T1 starts booking:</w:t>
       </w:r>
     </w:p>
     <w:p>
@@ -402,6 +559,40 @@
       </w:pPr>
       <w:r>
         <w:t>An academic calendar covering the next two months with one week-long break in the middle.</w:t>
+      </w:r>
+    </w:p>
+    <w:p>
+      <w:pPr>
+        <w:pStyle w:val="ListBullet"/>
+      </w:pPr>
+      <w:r>
+        <w:t xml:space="preserve">One photograph on </w:t>
+      </w:r>
+      <w:r>
+        <w:rPr>
+          <w:b/>
+        </w:rPr>
+        <w:t>UAT Meeting Room</w:t>
+      </w:r>
+      <w:r>
+        <w:t>.</w:t>
+      </w:r>
+    </w:p>
+    <w:p>
+      <w:pPr>
+        <w:jc w:val="left"/>
+      </w:pPr>
+      <w:r>
+        <w:t xml:space="preserve">On screen the Kulliyyah office is called </w:t>
+      </w:r>
+      <w:r>
+        <w:rPr>
+          <w:b/>
+        </w:rPr>
+        <w:t>the Admin</w:t>
+      </w:r>
+      <w:r>
+        <w:t>; "contact the Admin" is expected wording.</w:t>
       </w:r>
     </w:p>
     <w:p>
@@ -2213,7 +2404,7 @@
               <w:rPr>
                 <w:sz w:val="19"/>
               </w:rPr>
-              <w:t>Cards with photograph or drawing, name, type, location, seats. UAT Room is present.</w:t>
+              <w:t>Cards with photograph or drawing, name, type, location, seats. The three UAT venues are present.</w:t>
             </w:r>
           </w:p>
         </w:tc>
@@ -2277,7 +2468,7 @@
               <w:rPr>
                 <w:sz w:val="19"/>
               </w:rPr>
-              <w:t>Only UAT Room remains. The address bar shows the search, so the page can be bookmarked.</w:t>
+              <w:t>Only the three UAT venues remain. The address bar shows the search, so the page can be bookmarked.</w:t>
             </w:r>
           </w:p>
         </w:tc>
@@ -2341,7 +2532,7 @@
               <w:rPr>
                 <w:sz w:val="19"/>
               </w:rPr>
-              <w:t>UAT Room (capacity 10) disappears. Clear the filter; it returns.</w:t>
+              <w:t>Only UAT Moot Court (80) remains. Clear the filter; the other two return.</w:t>
             </w:r>
           </w:p>
         </w:tc>
@@ -2452,7 +2643,7 @@
               <w:rPr>
                 <w:sz w:val="19"/>
               </w:rPr>
-              <w:t>Open UAT Room.</w:t>
+              <w:t>Open UAT Meeting Room.</w:t>
             </w:r>
           </w:p>
         </w:tc>
@@ -4054,24 +4245,24 @@
               <w:rPr>
                 <w:sz w:val="19"/>
               </w:rPr>
-              <w:t>On the phone, book UAT Room for a date next week.</w:t>
-            </w:r>
-          </w:p>
-        </w:tc>
-        <w:tc>
-          <w:tcPr>
-            <w:tcW w:type="dxa" w:w="2436"/>
-          </w:tcPr>
-          <w:p>
-            <w:pPr>
-              <w:spacing w:before="40" w:after="40"/>
-            </w:pPr>
-            <w:r/>
-            <w:r>
-              <w:rPr>
-                <w:sz w:val="19"/>
-              </w:rPr>
-              <w:t>Form usable one-handed; date and time pickers are the phone's own; submit reaches the confirmation.</w:t>
+              <w:t>On the phone, book UAT Meeting Room for a date next week.</w:t>
+            </w:r>
+          </w:p>
+        </w:tc>
+        <w:tc>
+          <w:tcPr>
+            <w:tcW w:type="dxa" w:w="2436"/>
+          </w:tcPr>
+          <w:p>
+            <w:pPr>
+              <w:spacing w:before="40" w:after="40"/>
+            </w:pPr>
+            <w:r/>
+            <w:r>
+              <w:rPr>
+                <w:sz w:val="19"/>
+              </w:rPr>
+              <w:t>Form usable one-handed; the date picker is the phone's own and the times are a list; submit reaches the confirmation.</w:t>
             </w:r>
           </w:p>
         </w:tc>
@@ -4795,7 +4986,7 @@
               <w:rPr>
                 <w:sz w:val="19"/>
               </w:rPr>
-              <w:t xml:space="preserve">UAT Room → </w:t>
+              <w:t xml:space="preserve">UAT Meeting Room → </w:t>
             </w:r>
             <w:r>
               <w:rPr>
@@ -8327,7 +8518,7 @@
               <w:rPr>
                 <w:sz w:val="19"/>
               </w:rPr>
-              <w:t>. Create UAT Room 2 with no photograph.</w:t>
+              <w:t>. Create UAT Spare Room with no photograph.</w:t>
             </w:r>
           </w:p>
         </w:tc>
@@ -8904,7 +9095,7 @@
               <w:rPr>
                 <w:sz w:val="19"/>
               </w:rPr>
-              <w:t xml:space="preserve"> UAT Room 2 while it is active.</w:t>
+              <w:t xml:space="preserve"> UAT Spare Room while it is active.</w:t>
             </w:r>
           </w:p>
         </w:tc>
@@ -8968,7 +9159,7 @@
               <w:rPr>
                 <w:sz w:val="19"/>
               </w:rPr>
-              <w:t>Try to delete UAT Room (which has bookings).</w:t>
+              <w:t>Try to delete UAT Meeting Room (which has bookings).</w:t>
             </w:r>
           </w:p>
         </w:tc>
@@ -12507,7 +12698,7 @@
         <w:jc w:val="left"/>
       </w:pPr>
       <w:r>
-        <w:t>T3 cancels the remaining UAT bookings with the reason "UAT", sets UAT Room and UAT Car to inactive, deactivates the throwaway user, and removes the UAT announcement. Send the completed script, with screenshots of every Fail, to the developer.</w:t>
+        <w:t>T3 cancels the remaining UAT bookings with the reason "UAT", sets the three UAT venues and UAT Car to inactive, deactivates the throwaway user, and removes the UAT announcement. Send the completed script, with screenshots of every Fail, to the developer.</w:t>
       </w:r>
     </w:p>
     <w:sectPr>

</xml_diff>